<commit_message>
Tina Parte 4: revisão
Co-Authored-By: Claude Opus 5.5 <noreply@anthropic.com>
Claude-Session: https://claude.ai/code/session_01MJjUEEZrxQDEUifKK2vj9g
</commit_message>
<xml_diff>
--- a/roteiros/tina-turner/Tina_Parte4.docx
+++ b/roteiros/tina-turner/Tina_Parte4.docx
@@ -31,7 +31,7 @@
         <w:rPr>
           <w:color w:val="000000"/>
         </w:rPr>
-        <w:t>E, no começo de mil novecentos e setenta e seis, Ike estava prestes a acrescentar mais uma.</w:t>
+        <w:t>E, no começo de mil novecentos e setenta e seis, Ike estava prestes a acrescentar mais uma corrente.</w:t>
       </w:r>
     </w:p>
     <w:p>
@@ -63,7 +63,7 @@
         <w:rPr>
           <w:color w:val="000000"/>
         </w:rPr>
-        <w:t>Só que havia uma cláusula escondida nele.</w:t>
+        <w:t>Só que havia uma cláusula que mudava tudo.</w:t>
       </w:r>
     </w:p>
     <w:p>
@@ -183,7 +183,7 @@
         <w:rPr>
           <w:color w:val="C00000"/>
         </w:rPr>
-        <w:t>E aqui acontece uma coisa que nunca tinha acontecido em dezesseis anos. Uma coisa tão pequena e tão gigantesca que mudou o destino de Tina Turner naquela mesma noite.</w:t>
+        <w:t>E aqui acontece uma coisa pequena e gigantesca ao mesmo tempo. Uma coisa que mudou o destino de Tina Turner naquela mesma noite.</w:t>
       </w:r>
     </w:p>
     <w:p>
@@ -191,7 +191,7 @@
         <w:rPr>
           <w:color w:val="000000"/>
         </w:rPr>
-        <w:t>Pela primeira vez, Tina revidou.</w:t>
+        <w:t>Daquela vez, Tina revidou.</w:t>
       </w:r>
     </w:p>
     <w:p>
@@ -319,7 +319,7 @@
         <w:rPr>
           <w:color w:val="C00000"/>
         </w:rPr>
-        <w:t>Imagine essa mulher entrando na recepção de um hotel no meio da noite. O rosto inchado, a roupa manchada de sangue, trinta e seis centavos no bolso. E pedindo um quarto.</w:t>
+        <w:t>Imagine essa mulher entrando na recepção de um hotel no meio da noite. O rosto inchado e machucado, e trinta e seis centavos no bolso. E pedindo um quarto.</w:t>
       </w:r>
     </w:p>
     <w:p>

</xml_diff>